<commit_message>
Update AI Agents Whitepaper with Digital Measurement Partnership
Added Section 2.6: Strategic partnership with digital measurement experts
- Partnership value proposition (4 capability dimensions)
- 3 integration scenarios (on-site, remote+validation, expert mode)
- 3-layer moat model (data, workflow, certification)
- 4-tier business model (basic/pro/expert/enterprise)
- Technical integration architecture

Positions AI Designer for engineering-grade precision delivery.

🤖 Generated with [Qoder][https://qoder.com]
</commit_message>
<xml_diff>
--- a/docs/AI_Agents_Strategy_Whitepaper.docx
+++ b/docs/AI_Agents_Strategy_Whitepaper.docx
@@ -3014,6 +3014,527 @@
         <w:t>Generated: 2026-03-11 | Nestopia AI Strategy v1.0 | Confidential</w:t>
       </w:r>
     </w:p>
+    <w:p>
+      <w:pPr>
+        <w:pStyle w:val="Heading2"/>
+      </w:pPr>
+      <w:r>
+        <w:t>2.6 战略合作：数字测量专家集成（Future Differentiator）</w:t>
+      </w:r>
+    </w:p>
+    <w:p>
+      <w:r>
+        <w:rPr>
+          <w:b/>
+        </w:rPr>
+        <w:t>战略方向：</w:t>
+      </w:r>
+      <w:r>
+        <w:t>与专业数字测量解决方案厂商深度合作，将物理世界精准测量能力与 AI 场景融合能力无缝整合，构建"测量-设计-呈现"一体化闭环。</w:t>
+      </w:r>
+    </w:p>
+    <w:p/>
+    <w:p>
+      <w:pPr>
+        <w:pStyle w:val="Heading3"/>
+      </w:pPr>
+      <w:r>
+        <w:t>2.6.1 合作价值主张</w:t>
+      </w:r>
+    </w:p>
+    <w:tbl>
+      <w:tblPr>
+        <w:tblStyle w:val="TableGrid"/>
+        <w:tblW w:type="auto" w:w="0"/>
+        <w:tblLook w:firstColumn="1" w:firstRow="1" w:lastColumn="0" w:lastRow="0" w:noHBand="0" w:noVBand="1" w:val="04A0"/>
+      </w:tblPr>
+      <w:tblGrid>
+        <w:gridCol w:w="2880"/>
+        <w:gridCol w:w="2880"/>
+        <w:gridCol w:w="2880"/>
+      </w:tblGrid>
+      <w:tr>
+        <w:tc>
+          <w:tcPr>
+            <w:tcW w:type="dxa" w:w="2880"/>
+          </w:tcPr>
+          <w:p>
+            <w:r>
+              <w:t>能力维度</w:t>
+            </w:r>
+          </w:p>
+        </w:tc>
+        <w:tc>
+          <w:tcPr>
+            <w:tcW w:type="dxa" w:w="2880"/>
+          </w:tcPr>
+          <w:p>
+            <w:r>
+              <w:t>Nestopia 现有能力</w:t>
+            </w:r>
+          </w:p>
+        </w:tc>
+        <w:tc>
+          <w:tcPr>
+            <w:tcW w:type="dxa" w:w="2880"/>
+          </w:tcPr>
+          <w:p>
+            <w:r>
+              <w:t>合作伙伴补强</w:t>
+            </w:r>
+          </w:p>
+        </w:tc>
+      </w:tr>
+      <w:tr>
+        <w:tc>
+          <w:tcPr>
+            <w:tcW w:type="dxa" w:w="2880"/>
+          </w:tcPr>
+          <w:p>
+            <w:r>
+              <w:t>测量精度</w:t>
+            </w:r>
+          </w:p>
+        </w:tc>
+        <w:tc>
+          <w:tcPr>
+            <w:tcW w:type="dxa" w:w="2880"/>
+          </w:tcPr>
+          <w:p>
+            <w:r>
+              <w:t>照片估算 + 手动输入</w:t>
+            </w:r>
+          </w:p>
+        </w:tc>
+        <w:tc>
+          <w:tcPr>
+            <w:tcW w:type="dxa" w:w="2880"/>
+          </w:tcPr>
+          <w:p>
+            <w:r>
+              <w:t>激光扫描 / 摄影测量 / SLAM 技术 → 毫米级精度</w:t>
+            </w:r>
+          </w:p>
+        </w:tc>
+      </w:tr>
+      <w:tr>
+        <w:tc>
+          <w:tcPr>
+            <w:tcW w:type="dxa" w:w="2880"/>
+          </w:tcPr>
+          <w:p>
+            <w:r>
+              <w:t>数据采集</w:t>
+            </w:r>
+          </w:p>
+        </w:tc>
+        <w:tc>
+          <w:tcPr>
+            <w:tcW w:type="dxa" w:w="2880"/>
+          </w:tcPr>
+          <w:p>
+            <w:r>
+              <w:t>单张照片</w:t>
+            </w:r>
+          </w:p>
+        </w:tc>
+        <w:tc>
+          <w:tcPr>
+            <w:tcW w:type="dxa" w:w="2880"/>
+          </w:tcPr>
+          <w:p>
+            <w:r>
+              <w:t>360°全景扫描 / 点云数据 / 三维重建</w:t>
+            </w:r>
+          </w:p>
+        </w:tc>
+      </w:tr>
+      <w:tr>
+        <w:tc>
+          <w:tcPr>
+            <w:tcW w:type="dxa" w:w="2880"/>
+          </w:tcPr>
+          <w:p>
+            <w:r>
+              <w:t>复杂场景</w:t>
+            </w:r>
+          </w:p>
+        </w:tc>
+        <w:tc>
+          <w:tcPr>
+            <w:tcW w:type="dxa" w:w="2880"/>
+          </w:tcPr>
+          <w:p>
+            <w:r>
+              <w:t>平面庭院</w:t>
+            </w:r>
+          </w:p>
+        </w:tc>
+        <w:tc>
+          <w:tcPr>
+            <w:tcW w:type="dxa" w:w="2880"/>
+          </w:tcPr>
+          <w:p>
+            <w:r>
+              <w:t>异形地形 / 高差地形 / 既有建筑融合测量</w:t>
+            </w:r>
+          </w:p>
+        </w:tc>
+      </w:tr>
+      <w:tr>
+        <w:tc>
+          <w:tcPr>
+            <w:tcW w:type="dxa" w:w="2880"/>
+          </w:tcPr>
+          <w:p>
+            <w:r>
+              <w:t>输出格式</w:t>
+            </w:r>
+          </w:p>
+        </w:tc>
+        <w:tc>
+          <w:tcPr>
+            <w:tcW w:type="dxa" w:w="2880"/>
+          </w:tcPr>
+          <w:p>
+            <w:r>
+              <w:t>2D 融合图</w:t>
+            </w:r>
+          </w:p>
+        </w:tc>
+        <w:tc>
+          <w:tcPr>
+            <w:tcW w:type="dxa" w:w="2880"/>
+          </w:tcPr>
+          <w:p>
+            <w:r>
+              <w:t>CAD 图纸 / BIM 模型 / 工程级测量报告</w:t>
+            </w:r>
+          </w:p>
+        </w:tc>
+      </w:tr>
+    </w:tbl>
+    <w:p/>
+    <w:p>
+      <w:pPr>
+        <w:pStyle w:val="Heading3"/>
+      </w:pPr>
+      <w:r>
+        <w:t>2.6.2 集成场景设计</w:t>
+      </w:r>
+    </w:p>
+    <w:p>
+      <w:r>
+        <w:rPr>
+          <w:b/>
+        </w:rPr>
+        <w:t>场景 A：专业级现场测量</w:t>
+      </w:r>
+    </w:p>
+    <w:p>
+      <w:pPr>
+        <w:pStyle w:val="ListBullet"/>
+      </w:pPr>
+      <w:r>
+        <w:t>合作伙伴提供便携扫描设备 → 现场 5 分钟完成庭院扫描 → 自动生成点云模型 → AI Designer 基于精准模型进行产品融合设计 → 输出工程级方案</w:t>
+      </w:r>
+    </w:p>
+    <w:p>
+      <w:r>
+        <w:rPr>
+          <w:b/>
+        </w:rPr>
+        <w:t>场景 B：远程测量 + 本地验证</w:t>
+      </w:r>
+    </w:p>
+    <w:p>
+      <w:pPr>
+        <w:pStyle w:val="ListBullet"/>
+      </w:pPr>
+      <w:r>
+        <w:t>客户使用手机 APP（合作伙伴 SDK）自助扫描 → 云端生成初步模型 → 小企业主上门用专业设备复核关键尺寸 → AI Designer 基于双数据源优化设计</w:t>
+      </w:r>
+    </w:p>
+    <w:p>
+      <w:r>
+        <w:rPr>
+          <w:b/>
+        </w:rPr>
+        <w:t>场景 C：复杂地形专家模式</w:t>
+      </w:r>
+    </w:p>
+    <w:p>
+      <w:pPr>
+        <w:pStyle w:val="ListBullet"/>
+      </w:pPr>
+      <w:r>
+        <w:t>高差超过 1 米 / 异形边界 / 紧邻既有建筑的项目 → 自动触发"专家测量"流程 → 合作伙伴派测量师或提供高端设备 → 数据直传 Nestopia 生成合规设计方案</w:t>
+      </w:r>
+    </w:p>
+    <w:p/>
+    <w:p>
+      <w:pPr>
+        <w:pStyle w:val="Heading3"/>
+      </w:pPr>
+      <w:r>
+        <w:t>2.6.3 差异化壁垒构建</w:t>
+      </w:r>
+    </w:p>
+    <w:p>
+      <w:r>
+        <w:rPr>
+          <w:b/>
+        </w:rPr>
+        <w:t>三层护城河模型：</w:t>
+      </w:r>
+    </w:p>
+    <w:p>
+      <w:pPr>
+        <w:pStyle w:val="ListBullet"/>
+      </w:pPr>
+      <w:r>
+        <w:t>数据层：合作伙伴的测量数据 + Nestopia 的设计数据 → 联合训练专属模型</w:t>
+      </w:r>
+    </w:p>
+    <w:p>
+      <w:pPr>
+        <w:pStyle w:val="ListBullet"/>
+      </w:pPr>
+      <w:r>
+        <w:t>工作流层：从"测量→设计→报价→签约"无缝衔接，无数据断点</w:t>
+      </w:r>
+    </w:p>
+    <w:p>
+      <w:pPr>
+        <w:pStyle w:val="ListBullet"/>
+      </w:pPr>
+      <w:r>
+        <w:t>认证层：联合品牌认证"Nestopia 精准测量合作伙伴"，建立行业标准</w:t>
+      </w:r>
+    </w:p>
+    <w:p/>
+    <w:p>
+      <w:pPr>
+        <w:pStyle w:val="Heading3"/>
+      </w:pPr>
+      <w:r>
+        <w:t>2.6.4 商业模式建议</w:t>
+      </w:r>
+    </w:p>
+    <w:tbl>
+      <w:tblPr>
+        <w:tblStyle w:val="TableGrid"/>
+        <w:tblW w:type="auto" w:w="0"/>
+        <w:tblLook w:firstColumn="1" w:firstRow="1" w:lastColumn="0" w:lastRow="0" w:noHBand="0" w:noVBand="1" w:val="04A0"/>
+      </w:tblPr>
+      <w:tblGrid>
+        <w:gridCol w:w="2880"/>
+        <w:gridCol w:w="2880"/>
+        <w:gridCol w:w="2880"/>
+      </w:tblGrid>
+      <w:tr>
+        <w:tc>
+          <w:tcPr>
+            <w:tcW w:type="dxa" w:w="2880"/>
+          </w:tcPr>
+          <w:p>
+            <w:r>
+              <w:t>层级</w:t>
+            </w:r>
+          </w:p>
+        </w:tc>
+        <w:tc>
+          <w:tcPr>
+            <w:tcW w:type="dxa" w:w="2880"/>
+          </w:tcPr>
+          <w:p>
+            <w:r>
+              <w:t>服务内容</w:t>
+            </w:r>
+          </w:p>
+        </w:tc>
+        <w:tc>
+          <w:tcPr>
+            <w:tcW w:type="dxa" w:w="2880"/>
+          </w:tcPr>
+          <w:p>
+            <w:r>
+              <w:t>收费模式</w:t>
+            </w:r>
+          </w:p>
+        </w:tc>
+      </w:tr>
+      <w:tr>
+        <w:tc>
+          <w:tcPr>
+            <w:tcW w:type="dxa" w:w="2880"/>
+          </w:tcPr>
+          <w:p>
+            <w:r>
+              <w:t>基础版</w:t>
+            </w:r>
+          </w:p>
+        </w:tc>
+        <w:tc>
+          <w:tcPr>
+            <w:tcW w:type="dxa" w:w="2880"/>
+          </w:tcPr>
+          <w:p>
+            <w:r>
+              <w:t>照片估算 + AI 融合</w:t>
+            </w:r>
+          </w:p>
+        </w:tc>
+        <w:tc>
+          <w:tcPr>
+            <w:tcW w:type="dxa" w:w="2880"/>
+          </w:tcPr>
+          <w:p>
+            <w:r>
+              <w:t>含在 Nestopia 订阅内</w:t>
+            </w:r>
+          </w:p>
+        </w:tc>
+      </w:tr>
+      <w:tr>
+        <w:tc>
+          <w:tcPr>
+            <w:tcW w:type="dxa" w:w="2880"/>
+          </w:tcPr>
+          <w:p>
+            <w:r>
+              <w:t>专业版</w:t>
+            </w:r>
+          </w:p>
+        </w:tc>
+        <w:tc>
+          <w:tcPr>
+            <w:tcW w:type="dxa" w:w="2880"/>
+          </w:tcPr>
+          <w:p>
+            <w:r>
+              <w:t>SDK 集成 + 客户自助扫描</w:t>
+            </w:r>
+          </w:p>
+        </w:tc>
+        <w:tc>
+          <w:tcPr>
+            <w:tcW w:type="dxa" w:w="2880"/>
+          </w:tcPr>
+          <w:p>
+            <w:r>
+              <w:t>按扫描次数收费，收入分成</w:t>
+            </w:r>
+          </w:p>
+        </w:tc>
+      </w:tr>
+      <w:tr>
+        <w:tc>
+          <w:tcPr>
+            <w:tcW w:type="dxa" w:w="2880"/>
+          </w:tcPr>
+          <w:p>
+            <w:r>
+              <w:t>专家版</w:t>
+            </w:r>
+          </w:p>
+        </w:tc>
+        <w:tc>
+          <w:tcPr>
+            <w:tcW w:type="dxa" w:w="2880"/>
+          </w:tcPr>
+          <w:p>
+            <w:r>
+              <w:t>上门测量服务 + 工程级交付</w:t>
+            </w:r>
+          </w:p>
+        </w:tc>
+        <w:tc>
+          <w:tcPr>
+            <w:tcW w:type="dxa" w:w="2880"/>
+          </w:tcPr>
+          <w:p>
+            <w:r>
+              <w:t>按项目收费，合作伙伴主导</w:t>
+            </w:r>
+          </w:p>
+        </w:tc>
+      </w:tr>
+      <w:tr>
+        <w:tc>
+          <w:tcPr>
+            <w:tcW w:type="dxa" w:w="2880"/>
+          </w:tcPr>
+          <w:p>
+            <w:r>
+              <w:t>企业版</w:t>
+            </w:r>
+          </w:p>
+        </w:tc>
+        <w:tc>
+          <w:tcPr>
+            <w:tcW w:type="dxa" w:w="2880"/>
+          </w:tcPr>
+          <w:p>
+            <w:r>
+              <w:t>定制设备 + API 接入 + 专属模型</w:t>
+            </w:r>
+          </w:p>
+        </w:tc>
+        <w:tc>
+          <w:tcPr>
+            <w:tcW w:type="dxa" w:w="2880"/>
+          </w:tcPr>
+          <w:p>
+            <w:r>
+              <w:t>年度授权费</w:t>
+            </w:r>
+          </w:p>
+        </w:tc>
+      </w:tr>
+    </w:tbl>
+    <w:p/>
+    <w:p>
+      <w:pPr>
+        <w:pStyle w:val="Heading3"/>
+      </w:pPr>
+      <w:r>
+        <w:t>2.6.5 技术集成架构</w:t>
+      </w:r>
+    </w:p>
+    <w:p>
+      <w:r>
+        <w:t>数据接口：合作伙伴测量数据 → 标准化 API → Nestopia AI Designer</w:t>
+      </w:r>
+    </w:p>
+    <w:p>
+      <w:r>
+        <w:t>格式兼容：支持 .las / .e57 / .obj / .rvt 等工程格式自动转换</w:t>
+      </w:r>
+    </w:p>
+    <w:p>
+      <w:r>
+        <w:t>实时同步：测量完成 → 云端处理 → 5 分钟内设计可用</w:t>
+      </w:r>
+    </w:p>
+    <w:p>
+      <w:r>
+        <w:t>质量校验：AI 自动检测测量数据完整性 → 缺失数据预警 → 补测提醒</w:t>
+      </w:r>
+    </w:p>
+    <w:p/>
+    <w:p>
+      <w:r>
+        <w:rPr>
+          <w:b/>
+        </w:rPr>
+        <w:t>战略意义：</w:t>
+      </w:r>
+      <w:r>
+        <w:t xml:space="preserve"> 通过与专业测量厂商的战略合作，Nestopia 将 AI 设计能力从"视觉呈现"升级为"工程级精准交付"，在高端项目市场建立不可替代的技术壁垒。</w:t>
+      </w:r>
+    </w:p>
+    <w:p/>
     <w:sectPr>
       <w:pgSz w:w="12240" w:h="15840"/>
       <w:pgMar w:top="1440" w:right="1800" w:bottom="1440" w:left="1800" w:header="720" w:footer="720" w:gutter="0"/>

</xml_diff>